<commit_message>
Add documentation & PBI
</commit_message>
<xml_diff>
--- a/documentation/NFL_2026_Pipeline_Documentacao_PT.docx
+++ b/documentation/NFL_2026_Pipeline_Documentacao_PT.docx
@@ -150,7 +150,7 @@
           <w:sz w:val="22"/>
           <w:szCs w:val="22"/>
         </w:rPr>
-        <w:t xml:space="preserve">O esquema resultante (schema nfl no Supabase/PostgreSQL) tem: duas tabelas de referência estáticas (teams, positions); uma dimensão (players); nove tabelas de estatísticas individuais (passing, rushing, receiving, kicking, kick_return, punt_return, punting, defense, fumbles); e cinco tabelas de estatísticas de time (games, downs, passes, extra_points, tackles). Chaves estrangeiras ligam as tabelas individuais a players e as tabelas de time a teams.</w:t>
+        <w:t xml:space="preserve">O esquema resultante (schema nfl no Supabase/PostgreSQL) tem: duas tabelas de referência estáticas (teams, positions); uma dimensão (players); nove tabelas de estatísticas individuais (passing, rushing, receiving, kicking, kick_return, punt_return, punting, defense, fumbles); e duas tabelas de estatísticas de time (games, downs). Chaves estrangeiras ligam as tabelas individuais a players e as tabelas de time a teams. Três outras tabelas de time do desenho original (passes, extra_points, tackles) foram removidas por nunca terem sido usadas — ver seção 9.</w:t>
       </w:r>
     </w:p>
     <w:p>
@@ -408,7 +408,7 @@
           <w:sz w:val="22"/>
           <w:szCs w:val="22"/>
         </w:rPr>
-        <w:t xml:space="preserve">O schema do banco passou por duas rodadas de correção depois de ser conferido contra o que o nfl.com de fato publica, em vez do que os metadados originais do Power BI supunham.</w:t>
+        <w:t xml:space="preserve">O schema do banco passou por quatro rodadas de correção depois de ser conferido contra o que o nfl.com de fato publica, em vez do que os metadados originais do Power BI supunham.</w:t>
       </w:r>
     </w:p>
     <w:p>
@@ -435,6 +435,32 @@
           <w:szCs w:val="22"/>
         </w:rPr>
         <w:t xml:space="preserve">A segunda rodada, maior, seguiu a decisão de migrar para o método de extração por líderes de categoria. Quase todas as tabelas de estatísticas individuais mudaram de formato para bater com as colunas realmente disponíveis por esse método: uma coluna de jogos disputados foi removida de todas (as listagens de líderes não a reportam); passing, rushing e receiving ganharam colunas de taxa e porcentagem não modeladas antes; kicking foi reconstruída para combinar as categorias Field Goals e Kickoffs, que — diferente da página por jogador — de fato reportam field goals por faixa de distância, mais perto do desenho original afinal; fumbles foi dividida em um lado defensivo (forçados e recuperados, da categoria Fumbles) e um lado ofensivo (fumbles cometidos correndo ou recebendo, somados dessas duas categorias); e defense foi reduzida aos campos que o scraper por jogador consegue fornecer, com o detalhe de interceptação vindo de sua própria categoria de líderes.</w:t>
+      </w:r>
+    </w:p>
+    <w:p>
+      <w:pPr>
+        <w:spacing w:after="160"/>
+        <w:jc w:val="both"/>
+      </w:pPr>
+      <w:r>
+        <w:rPr>
+          <w:sz w:val="22"/>
+          <w:szCs w:val="22"/>
+        </w:rPr>
+        <w:t xml:space="preserve">A terceira rodada tratou das tabelas de nível time do desenho original. Passes, Extra_Points e Tackles (versões de time) nunca chegaram a ter um script de extração — o pipeline acabou cobrindo esse mesmo terreno no nível de jogador (passing, kicking, defense), tornando as versões de time redundantes — então foram removidas. Downs, a única tabela de time sem equivalente no nível de jogador, foi mantida e finalmente ligada a uma fonte real: uma página de líderes de estatísticas de time no nfl.com, estruturalmente parecida com a de jogador (uma linha por time, sem necessidade de paginação), que por sinal também traz first downs por tipo (corrida, recepção) além de conversões de 3ª e 4ª descida — colunas que foram adicionadas à tabela.</w:t>
+      </w:r>
+    </w:p>
+    <w:p>
+      <w:pPr>
+        <w:spacing w:after="160"/>
+        <w:jc w:val="both"/>
+      </w:pPr>
+      <w:r>
+        <w:rPr>
+          <w:sz w:val="22"/>
+          <w:szCs w:val="22"/>
+        </w:rPr>
+        <w:t xml:space="preserve">Snapshots semanais foram adicionados numa quarta rodada, depois de perceber que os totais acumulados da temporada, sobrescritos toda semana, não sustentavam medidas de tendência semana a semana no dashboard. As nove tabelas de estatísticas individuais (e só elas — as tabelas de nível time já tinham granularidade semanal própria, ou, no caso de downs, ainda não têm) ganharam week como parte da chave primária, transformando cada extração semanal numa linha nova em vez de uma substituição da anterior; a semana atual é inferida automaticamente a partir dos dados de jogos obtidos na mesma execução.</w:t>
       </w:r>
     </w:p>
     <w:p>
@@ -794,9 +820,86 @@
         <w:t xml:space="preserve">Toda execução envia os arquivos CSV extraídos e transformados como um artefato do workflow, mantido por quatorze dias, independentemente de a execução ter tido sucesso ou não, para que uma falha possa ser investigada a partir dos dados exatos que a causaram, sem precisar reproduzi-la localmente primeiro.</w:t>
       </w:r>
     </w:p>
+    <w:p>
+      <w:pPr>
+        <w:sectPr>
+          <w:pgSz w:w="12240" w:h="15840" w:orient="portrait"/>
+          <w:pgMar w:top="1000" w:right="1200" w:bottom="1000" w:left="1200" w:header="708" w:footer="708" w:gutter="0"/>
+          <w:pgNumType/>
+          <w:docGrid w:linePitch="360"/>
+        </w:sectPr>
+      </w:pPr>
+    </w:p>
+    <w:p>
+      <w:pPr>
+        <w:pStyle w:val="Heading1"/>
+        <w:spacing w:after="140" w:before="280"/>
+      </w:pPr>
+      <w:r>
+        <w:t xml:space="preserve">Apêndice A. Diagrama Entidade-Relacionamento</w:t>
+      </w:r>
+    </w:p>
+    <w:p>
+      <w:pPr>
+        <w:spacing w:after="160"/>
+        <w:jc w:val="both"/>
+      </w:pPr>
+      <w:r>
+        <w:rPr>
+          <w:sz w:val="22"/>
+          <w:szCs w:val="22"/>
+        </w:rPr>
+        <w:t xml:space="preserve">O diagrama abaixo reflete o schema como está atualmente implantado no Supabase: duas tabelas de referência estáticas (teams, positions), a dimensão players, duas tabelas de estatísticas de time (games, downs) e nove tabelas de estatísticas individuais de jogador. As chaves estrangeiras mostradas foram inferidas pela convenção de nomenclatura usada em todo o schema: toda coluna team_id fora de teams referencia teams.team_id (o mesmo vale para games.opponent_id); player_position fora de positions referencia positions.player_position; e toda tabela de estatística individual se liga a players pela chave composta (player_id_team, season).</w:t>
+      </w:r>
+    </w:p>
+    <w:p>
+      <w:pPr>
+        <w:jc w:val="center"/>
+      </w:pPr>
+      <w:r>
+        <w:drawing>
+          <wp:inline distT="0" distB="0" distL="0" distR="0">
+            <wp:extent cx="9810750" cy="5600700"/>
+            <wp:effectExtent t="0" r="0" b="0" l="0"/>
+            <wp:docPr id="1" name="" descr="" title=""/>
+            <wp:cNvGraphicFramePr>
+              <a:graphicFrameLocks xmlns:a="http://schemas.openxmlformats.org/drawingml/2006/main" noChangeAspect="1"/>
+            </wp:cNvGraphicFramePr>
+            <a:graphic xmlns:a="http://schemas.openxmlformats.org/drawingml/2006/main">
+              <a:graphicData uri="http://schemas.openxmlformats.org/drawingml/2006/picture">
+                <pic:pic xmlns:pic="http://schemas.openxmlformats.org/drawingml/2006/picture">
+                  <pic:nvPicPr>
+                    <pic:cNvPr id="0" name="" descr=""/>
+                    <pic:cNvPicPr>
+                      <a:picLocks noChangeAspect="1" noChangeArrowheads="1"/>
+                    </pic:cNvPicPr>
+                  </pic:nvPicPr>
+                  <pic:blipFill>
+                    <a:blip r:embed="rId7" cstate="none"/>
+                    <a:srcRect/>
+                    <a:stretch>
+                      <a:fillRect/>
+                    </a:stretch>
+                  </pic:blipFill>
+                  <pic:spPr bwMode="auto">
+                    <a:xfrm>
+                      <a:off x="0" y="0"/>
+                      <a:ext cx="9810750" cy="5600700"/>
+                    </a:xfrm>
+                    <a:prstGeom prst="rect">
+                      <a:avLst/>
+                    </a:prstGeom>
+                  </pic:spPr>
+                </pic:pic>
+              </a:graphicData>
+            </a:graphic>
+          </wp:inline>
+        </w:drawing>
+      </w:r>
+    </w:p>
     <w:sectPr>
-      <w:pgSz w:w="12240" w:h="15840" w:orient="portrait"/>
-      <w:pgMar w:top="1000" w:right="1200" w:bottom="1000" w:left="1200" w:header="708" w:footer="708" w:gutter="0"/>
+      <w:pgSz w:w="15840" w:h="12240" w:orient="landscape"/>
+      <w:pgMar w:top="700" w:right="700" w:bottom="700" w:left="700" w:header="708" w:footer="708" w:gutter="0"/>
       <w:pgNumType/>
       <w:docGrid w:linePitch="360"/>
     </w:sectPr>

</xml_diff>